<commit_message>
docs: finalize phase one technical specification and update client clarifications
</commit_message>
<xml_diff>
--- a/docs/contract/phase-1/Phase_1_Technical_Specification_HY.docx
+++ b/docs/contract/phase-1/Phase_1_Technical_Specification_HY.docx
@@ -85,7 +85,7 @@
                 <w:color w:val="000000"/>
                 <w:sz w:val="20"/>
               </w:rPr>
-              <w:t>1.0</w:t>
+              <w:t>1.1</w:t>
             </w:r>
           </w:p>
         </w:tc>
@@ -7867,6 +7867,20 @@
       <w:r>
         <w:rPr>
           <w:rFonts w:ascii="Noto Sans Armenian" w:hAnsi="Noto Sans Armenian" w:eastAsia="Noto Sans Armenian" w:cs="Noto Sans Armenian"/>
+          <w:b w:val="0"/>
+          <w:color w:val="000000"/>
+          <w:sz w:val="21"/>
+        </w:rPr>
+        <w:t>ADM-03-ում թվարկված դերերը սկզբնական ստանդարտ կազմն են և չեն փոխարինում Պատվիրատուի փաստացի կազմակերպական կառուցվածքին։ Մշակման մեկնարկից հետո Պատվիրատուն տրամադրում է իր ստորաբաժանումների, աշխատակիցների, պաշտոնների և դերերի համապատասխանեցման տվյալները, իսկ Կատարողը մինչև UAT-ը դրանց հիման վրա կատարում է սկզբնական կարգավորումը։ Գործող իրավունքների համակցությամբ նոր դերերի ստեղծումը և աշխատակիցների վերանշանակումը կատարվում են համակարգի վարչարարական գործիքներով՝ առանց ծրագրային կոդի փոփոխության։ Նոր էկրան, նոր workflow կամ նախկինում չնախատեսված տվյալային սահմանափակում պահանջող դերը համարվում է նոր գործառութային պահանջ։</w:t>
+      </w:r>
+    </w:p>
+    <w:p>
+      <w:pPr>
+        <w:spacing w:after="100" w:line="259" w:lineRule="auto"/>
+      </w:pPr>
+      <w:r>
+        <w:rPr>
+          <w:rFonts w:ascii="Noto Sans Armenian" w:hAnsi="Noto Sans Armenian" w:eastAsia="Noto Sans Armenian" w:cs="Noto Sans Armenian"/>
           <w:b/>
           <w:color w:val="000000"/>
           <w:sz w:val="21"/>
@@ -8774,7 +8788,99 @@
           <w:color w:val="000000"/>
           <w:sz w:val="25"/>
         </w:rPr>
-        <w:t>7.2. Ձևանմուշների բովանդակության առևտրային սահմանը</w:t>
+        <w:t>7.2. Ձևանմուշների բովանդակության և աջակցության սահմանը</w:t>
+      </w:r>
+    </w:p>
+    <w:p>
+      <w:pPr>
+        <w:spacing w:after="100" w:line="259" w:lineRule="auto"/>
+      </w:pPr>
+      <w:r>
+        <w:rPr>
+          <w:rFonts w:ascii="Noto Sans Armenian" w:hAnsi="Noto Sans Armenian" w:eastAsia="Noto Sans Armenian" w:cs="Noto Sans Armenian"/>
+          <w:b w:val="0"/>
+          <w:color w:val="000000"/>
+          <w:sz w:val="21"/>
+        </w:rPr>
+        <w:t>Փուլ I-ի շրջանակում Կատարողը ողջամիտ ծավալով աջակցում է առաջին գործարկման փաստաթղթերի փաթեթի ձևավորմանը՝</w:t>
+      </w:r>
+    </w:p>
+    <w:p>
+      <w:pPr>
+        <w:pStyle w:val="ListBullet"/>
+        <w:spacing w:after="100" w:line="259" w:lineRule="auto"/>
+        <w:ind w:left="360" w:hanging="259"/>
+      </w:pPr>
+      <w:r>
+        <w:rPr>
+          <w:rFonts w:ascii="Noto Sans Armenian" w:hAnsi="Noto Sans Armenian" w:eastAsia="Noto Sans Armenian" w:cs="Noto Sans Armenian"/>
+          <w:b w:val="0"/>
+          <w:color w:val="000000"/>
+          <w:sz w:val="21"/>
+        </w:rPr>
+        <w:t>ուսումնասիրում է Պատվիրատուի տրամադրած նմուշներն ու չափորոշիչները,</w:t>
+      </w:r>
+    </w:p>
+    <w:p>
+      <w:pPr>
+        <w:pStyle w:val="ListBullet"/>
+        <w:spacing w:after="100" w:line="259" w:lineRule="auto"/>
+        <w:ind w:left="360" w:hanging="259"/>
+      </w:pPr>
+      <w:r>
+        <w:rPr>
+          <w:rFonts w:ascii="Noto Sans Armenian" w:hAnsi="Noto Sans Armenian" w:eastAsia="Noto Sans Armenian" w:cs="Noto Sans Armenian"/>
+          <w:b w:val="0"/>
+          <w:color w:val="000000"/>
+          <w:sz w:val="21"/>
+        </w:rPr>
+        <w:t>որոնում և առաջարկում է հրապարակայնորեն հասանելի պաշտոնական կամ գործնականում կիրառվող օրինակներ,</w:t>
+      </w:r>
+    </w:p>
+    <w:p>
+      <w:pPr>
+        <w:pStyle w:val="ListBullet"/>
+        <w:spacing w:after="100" w:line="259" w:lineRule="auto"/>
+        <w:ind w:left="360" w:hanging="259"/>
+      </w:pPr>
+      <w:r>
+        <w:rPr>
+          <w:rFonts w:ascii="Noto Sans Armenian" w:hAnsi="Noto Sans Armenian" w:eastAsia="Noto Sans Armenian" w:cs="Noto Sans Armenian"/>
+          <w:b w:val="0"/>
+          <w:color w:val="000000"/>
+          <w:sz w:val="21"/>
+        </w:rPr>
+        <w:t>օգնում է կառուցվածքավորել համաձայնեցված ձևերի դաշտերը,</w:t>
+      </w:r>
+    </w:p>
+    <w:p>
+      <w:pPr>
+        <w:pStyle w:val="ListBullet"/>
+        <w:spacing w:after="100" w:line="259" w:lineRule="auto"/>
+        <w:ind w:left="360" w:hanging="259"/>
+      </w:pPr>
+      <w:r>
+        <w:rPr>
+          <w:rFonts w:ascii="Noto Sans Armenian" w:hAnsi="Noto Sans Armenian" w:eastAsia="Noto Sans Armenian" w:cs="Noto Sans Armenian"/>
+          <w:b w:val="0"/>
+          <w:color w:val="000000"/>
+          <w:sz w:val="21"/>
+        </w:rPr>
+        <w:t>կոնստրուկտորի հնարավորությունների սահմաններում աջակցում է համաձայնեցված մեկնարկային ձևերի տեխնիկական կարգավորմանը։</w:t>
+      </w:r>
+    </w:p>
+    <w:p>
+      <w:pPr>
+        <w:spacing w:after="100" w:line="259" w:lineRule="auto"/>
+      </w:pPr>
+      <w:r>
+        <w:rPr>
+          <w:rFonts w:ascii="Noto Sans Armenian" w:hAnsi="Noto Sans Armenian" w:eastAsia="Noto Sans Armenian" w:cs="Noto Sans Armenian"/>
+          <w:b w:val="0"/>
+          <w:color w:val="000000"/>
+          <w:sz w:val="21"/>
+        </w:rPr>
+        <w:t>Պատվիրատուն տրամադրում է առաջին գործարկման համար անհրաժեշտ փաստաթղթերի փակ ցանկը, իր մոտ առկա նմուշները և պարտադիր չափորոշիչները։ Եթե որոշ փաստաթղթի բժշկական կամ իրավական բովանդակությունը հնարավոր չէ միանշանակ որոշել հասանելի պաշտոնական աղբյուրներով, այն տրամադրում կամ հաստատում է Պատվիրատուի լիազորված բժշկական կամ իրավաբանական մասնագետը։ Վերջնական բժշկական և իրավական բովանդակության հաստատման պատասխանատվությունը կրում է Պատվիրատուն։</w:t>
       </w:r>
     </w:p>
     <w:p>
@@ -8838,7 +8944,7 @@
           <w:color w:val="000000"/>
           <w:sz w:val="21"/>
         </w:rPr>
-        <w:t>թղթային կամ այլ ձևաչափի փաստաթղթերի թվայնացում,</w:t>
+        <w:t>իրավաբանական եզրակացության կամ պարտադիր պետական ձևի իրավական վավերության հաստատում,</w:t>
       </w:r>
     </w:p>
     <w:p>
@@ -8854,7 +8960,7 @@
           <w:color w:val="000000"/>
           <w:sz w:val="21"/>
         </w:rPr>
-        <w:t>Պատվիրատուի կոնկրետ ձևանմուշների ձեռքով ստեղծում և դաշտերի լրացում,</w:t>
+        <w:t>չսահմանափակված կամ զանգվածային թղթային արխիվի թվայնացում,</w:t>
       </w:r>
     </w:p>
     <w:p>
@@ -8870,12 +8976,14 @@
           <w:color w:val="000000"/>
           <w:sz w:val="21"/>
         </w:rPr>
-        <w:t>անսահմանափակ խմբագրումների ու համաձայնեցումների փուլեր։</w:t>
+        <w:t>կոնստրուկտորի հնարավորություններից դուրս առանձին ծրագրային մշակում պահանջող ձևեր,</w:t>
       </w:r>
     </w:p>
     <w:p>
       <w:pPr>
+        <w:pStyle w:val="ListBullet"/>
         <w:spacing w:after="100" w:line="259" w:lineRule="auto"/>
+        <w:ind w:left="360" w:hanging="259"/>
       </w:pPr>
       <w:r>
         <w:rPr>
@@ -8884,7 +8992,21 @@
           <w:color w:val="000000"/>
           <w:sz w:val="21"/>
         </w:rPr>
-        <w:t>Պատվիրատուն ձևանմուշները ստեղծում է ինքնուրույն՝ կոնստրուկտորի միջոցով, կամ դրանց պատրաստումն առանձին պատվիրում է Կատարողին՝ փակ ցանկով, քանակով, բարդությամբ, ժամկետով և արժեքով։ Պատվիրատուն պատասխանատու է ձևանմուշների բժշկական և իրավական բովանդակության հաստատման համար։</w:t>
+        <w:t>անսահմանափակ խմբագրումների, բովանդակային վերամշակման կամ հետգործարկման զանգվածային մուտքագրման աշխատանքներ։</w:t>
+      </w:r>
+    </w:p>
+    <w:p>
+      <w:pPr>
+        <w:spacing w:after="100" w:line="259" w:lineRule="auto"/>
+      </w:pPr>
+      <w:r>
+        <w:rPr>
+          <w:rFonts w:ascii="Noto Sans Armenian" w:hAnsi="Noto Sans Armenian" w:eastAsia="Noto Sans Armenian" w:cs="Noto Sans Armenian"/>
+          <w:b w:val="0"/>
+          <w:color w:val="000000"/>
+          <w:sz w:val="21"/>
+        </w:rPr>
+        <w:t>Կոնստրուկտորի սահմաններում փոքր ճշգրտումները և համաձայնեցված մեկնարկային փաթեթի ողջամիտ տեխնիկական աջակցությունը չեն համարվում առանձին նոր գործառույթ։ Կոնստրուկտորից դուրս նոր վարքագիծ պահանջող ձևը գնահատվում է որպես ծրագրային փոփոխության հայտ։</w:t>
       </w:r>
     </w:p>
     <w:p>
@@ -9099,6 +9221,20 @@
     </w:p>
     <w:p>
       <w:pPr>
+        <w:spacing w:after="100" w:line="259" w:lineRule="auto"/>
+      </w:pPr>
+      <w:r>
+        <w:rPr>
+          <w:rFonts w:ascii="Noto Sans Armenian" w:hAnsi="Noto Sans Armenian" w:eastAsia="Noto Sans Armenian" w:cs="Noto Sans Armenian"/>
+          <w:b w:val="0"/>
+          <w:color w:val="000000"/>
+          <w:sz w:val="21"/>
+        </w:rPr>
+        <w:t>Կողմերը հաստատում են, որ բժշկական համալիրը նոր է, պարտադիր պատմական կամ legacy տվյալների աղբյուրներ չկան, և Փուլ I-ի համար պատմական տվյալների տեղափոխում չի պահանջվում։</w:t>
+      </w:r>
+    </w:p>
+    <w:p>
+      <w:pPr>
         <w:pStyle w:val="Heading1"/>
       </w:pPr>
       <w:r>
@@ -9242,7 +9378,7 @@
           <w:color w:val="000000"/>
           <w:sz w:val="21"/>
         </w:rPr>
-        <w:t>պետական առողջապահական կամ այլ պետական հարթակների հետ,</w:t>
+        <w:t>ARMED-ի, ՀՀ էլեկտրոնային առողջապահության այլ պետական կամ լիազորված հարթակների հետ,</w:t>
       </w:r>
     </w:p>
     <w:p>
@@ -9359,6 +9495,20 @@
     </w:p>
     <w:p>
       <w:pPr>
+        <w:spacing w:after="100" w:line="259" w:lineRule="auto"/>
+      </w:pPr>
+      <w:r>
+        <w:rPr>
+          <w:rFonts w:ascii="Noto Sans Armenian" w:hAnsi="Noto Sans Armenian" w:eastAsia="Noto Sans Armenian" w:cs="Noto Sans Armenian"/>
+          <w:b w:val="0"/>
+          <w:color w:val="000000"/>
+          <w:sz w:val="21"/>
+        </w:rPr>
+        <w:t>Փուլ I-ում ARMED-ի հետ ավտոմատ տեխնիկական ինտեգրում չի իրականացվում։ Պատվիրատուն մինչև լիցենզավորված բժշկական գործունեության մեկնարկը ինքնուրույն ապահովում է էլեկտրոնային առողջապահության պետական համակարգի օպերատորի հետ անհրաժեշտ պայմանագրային հարաբերությունները, միացումը, օգտատերերի հասանելիությունները և օրենսդրությամբ պահանջվող տվյալների մուտքագրումը։ Մինչև հետագա առանձին ինտեգրման իրականացումը Պատվիրատուի պատասխանատու աշխատակիցներն այդ գործողությունները կատարում են անմիջապես պետական համակարգի միջոցով՝ սույն HIS-ից անկախ։</w:t>
+      </w:r>
+    </w:p>
+    <w:p>
+      <w:pPr>
         <w:pStyle w:val="Heading2"/>
       </w:pPr>
       <w:r>
@@ -9382,7 +9532,7 @@
           <w:color w:val="000000"/>
           <w:sz w:val="21"/>
         </w:rPr>
-        <w:t>Փուլ I-ում Համակարգն ապահովում է ներքին էլեկտրոնային հաստատում և Audit Trail։ Այն ինքնաբերաբար չի համարվում որակավորված էլեկտրոնային ստորագրություն։ Պատվիրատուն մինչև արտադրական գործարկումը հաստատում է փաստաթղթերի մատրիցան՝ նշելով, թե որ փաստաթղթերի համար բավարար է ներքին հաստատումը, որոնք պետք է տպվեն և ստորագրվեն ձեռքով, և որոնք ապագայում պահանջում են որակավորված էլեկտրոնային ստորագրություն։</w:t>
+        <w:t>Փուլ I-ում Համակարգն ապահովում է ներքին էլեկտրոնային հաստատում և Audit Trail։ Այն ինքնաբերաբար չի համարվում որակավորված էլեկտրոնային ստորագրություն։ Այն փաստաթղթերը, որոնց համար կիրառելի իրավական կամ ներքին կարգով ներքին հաստատումը բավարար չէ, մինչև հետագա որակավորված էլեկտրոնային ստորագրության ինտեգրումը տպվում և ստորագրվում են Պատվիրատուի սահմանած կարգով։</w:t>
       </w:r>
     </w:p>
     <w:p>
@@ -11134,15 +11284,17 @@
           <w:color w:val="000000"/>
           <w:sz w:val="21"/>
         </w:rPr>
-        <w:t>տրամադրել առաջին գործարկման ստորաբաժանումների, ծառայությունների և մասնագիտությունների հաստատված ցանկը,</w:t>
+        <w:t xml:space="preserve">մշակման մեկնարկից հետո համաձայնեցված ձևաչափով տրամադրել </w:t>
       </w:r>
-    </w:p>
-    <w:p>
-      <w:pPr>
-        <w:pStyle w:val="ListBullet"/>
-        <w:spacing w:after="100" w:line="259" w:lineRule="auto"/>
-        <w:ind w:left="360" w:hanging="259"/>
-      </w:pPr>
+      <w:r>
+        <w:rPr>
+          <w:rFonts w:ascii="Noto Sans Armenian" w:hAnsi="Noto Sans Armenian" w:eastAsia="Noto Sans Armenian" w:cs="Noto Sans Armenian"/>
+          <w:b/>
+          <w:color w:val="000000"/>
+          <w:sz w:val="21"/>
+        </w:rPr>
+        <w:t>կազմակերպական և սկզբնական տվյալների փաթեթը</w:t>
+      </w:r>
       <w:r>
         <w:rPr>
           <w:rFonts w:ascii="Noto Sans Armenian" w:hAnsi="Noto Sans Armenian" w:eastAsia="Noto Sans Armenian" w:cs="Noto Sans Armenian"/>
@@ -11150,7 +11302,7 @@
           <w:color w:val="000000"/>
           <w:sz w:val="21"/>
         </w:rPr>
-        <w:t>տրամադրել և հաստատել տեղեկատուները, ձևանմուշների բովանդակությունը, փաստաթղթերի նմուշները, գները, ժամանակացույցերը և այլ սկզբնական տվյալները,</w:t>
+        <w:t>՝ առաջին գործարկման ստորաբաժանումները, ծառայությունները, մասնագիտությունները, հիվանդասենյակները, մահճակալները, աշխատակիցները, պաշտոնները, դերերի համապատասխանեցումը, ժամանակացույցերը, ծառայությունների կատալոգը, կոդերը, գները, վճարողների տվյալները, կիրառվող ICD-ն, դեղերի և լաբորատոր հետազոտությունների տեղեկատուները, չափման միավորները, հղումային միջակայքներն ու կրիտիկական շեմերը,</w:t>
       </w:r>
     </w:p>
     <w:p>
@@ -11166,7 +11318,25 @@
           <w:color w:val="000000"/>
           <w:sz w:val="21"/>
         </w:rPr>
-        <w:t>հաստատել կիրառվող ICD-ն, լաբորատոր տեղեկատուները, հղումային միջակայքները և կրիտիկական շեմերը,</w:t>
+        <w:t xml:space="preserve">մշակման մեկնարկից հետո տրամադրել </w:t>
+      </w:r>
+      <w:r>
+        <w:rPr>
+          <w:rFonts w:ascii="Noto Sans Armenian" w:hAnsi="Noto Sans Armenian" w:eastAsia="Noto Sans Armenian" w:cs="Noto Sans Armenian"/>
+          <w:b/>
+          <w:color w:val="000000"/>
+          <w:sz w:val="21"/>
+        </w:rPr>
+        <w:t>փաստաթղթերի և ձևանմուշների փաթեթը</w:t>
+      </w:r>
+      <w:r>
+        <w:rPr>
+          <w:rFonts w:ascii="Noto Sans Armenian" w:hAnsi="Noto Sans Armenian" w:eastAsia="Noto Sans Armenian" w:cs="Noto Sans Armenian"/>
+          <w:b w:val="0"/>
+          <w:color w:val="000000"/>
+          <w:sz w:val="21"/>
+        </w:rPr>
+        <w:t>՝ առաջին գործարկման համար անհրաժեշտ բժշկական և վարչական փաստաթղթերի փակ ցանկը, առկա նմուշները, պետական/ներքին չափորոշիչները, հաստատված տեքստերը և բովանդակությունը հաստատող լիազորված բժշկական կամ իրավաբանական մասնագետներին,</w:t>
       </w:r>
     </w:p>
     <w:p>
@@ -11198,23 +11368,7 @@
           <w:color w:val="000000"/>
           <w:sz w:val="21"/>
         </w:rPr>
-        <w:t>ընտրել/հաստատել արտաքին ֆիսկալ և հաշվապահական աշխատանքային գործընթացը,</w:t>
-      </w:r>
-    </w:p>
-    <w:p>
-      <w:pPr>
-        <w:pStyle w:val="ListBullet"/>
-        <w:spacing w:after="100" w:line="259" w:lineRule="auto"/>
-        <w:ind w:left="360" w:hanging="259"/>
-      </w:pPr>
-      <w:r>
-        <w:rPr>
-          <w:rFonts w:ascii="Noto Sans Armenian" w:hAnsi="Noto Sans Armenian" w:eastAsia="Noto Sans Armenian" w:cs="Noto Sans Armenian"/>
-          <w:b w:val="0"/>
-          <w:color w:val="000000"/>
-          <w:sz w:val="21"/>
-        </w:rPr>
-        <w:t>տրամադրել փաստաթղթերի իրավական հաստատման մատրիցան,</w:t>
+        <w:t>ինքնուրույն ապահովել ARMED-ի կամ կիրառելի պետական էլեկտրոնային առողջապահական համակարգի հետ պայմանագիրը, միացումը, հասանելիությունները և պարտադիր տվյալների մուտքագրումը մինչև հետագա ինտեգրումը,</w:t>
       </w:r>
     </w:p>
     <w:p>
@@ -11246,23 +11400,7 @@
           <w:color w:val="000000"/>
           <w:sz w:val="21"/>
         </w:rPr>
-        <w:t>տրամադրել բեռնվածության հաշվարկի համար հաշիվների, միաժամանակյա օգտատերերի, մահճակալների, օրական գործառնությունների, ֆայլերի ծավալի և պահպանման ժամկետների տվյալները,</w:t>
-      </w:r>
-    </w:p>
-    <w:p>
-      <w:pPr>
-        <w:pStyle w:val="ListBullet"/>
-        <w:spacing w:after="100" w:line="259" w:lineRule="auto"/>
-        <w:ind w:left="360" w:hanging="259"/>
-      </w:pPr>
-      <w:r>
-        <w:rPr>
-          <w:rFonts w:ascii="Noto Sans Armenian" w:hAnsi="Noto Sans Armenian" w:eastAsia="Noto Sans Armenian" w:cs="Noto Sans Armenian"/>
-          <w:b w:val="0"/>
-          <w:color w:val="000000"/>
-          <w:sz w:val="21"/>
-        </w:rPr>
-        <w:t>ապահովել UAT-ի համար իրական սցենարներ, լիազորված օգտատերեր և համաձայնեցված ժամկետում համախմբված արձագանք,</w:t>
+        <w:t>ապահովել UAT-ին լիազորված օգտատերերի մասնակցությունը և համաձայնեցված ժամկետում համախմբված արձագանքը,</w:t>
       </w:r>
     </w:p>
     <w:p>
@@ -11561,7 +11699,7 @@
           <w:color w:val="000000"/>
           <w:sz w:val="21"/>
         </w:rPr>
-        <w:t>17. Պատվիրատուի բժշկական բովանդակության, պատրաստ ձևանմուշների և տվյալների ձեռքով ստեղծում,</w:t>
+        <w:t>17. Պատվիրատուի փոխարեն բժշկական կամ իրավական բովանդակության հեղինակային ստեղծում, իրավական վավերության հաստատում, անսահմանափակ կամ զանգվածային ձևանմուշների/տվյալների մուտքագրում և թղթային արխիվի թվայնացում,</w:t>
       </w:r>
     </w:p>
     <w:p>
@@ -12441,7 +12579,7 @@
                 <w:color w:val="000000"/>
                 <w:sz w:val="18"/>
               </w:rPr>
-              <w:t>Ձևանմուշների կոնստրուկտորը ներառված է, իսկ Պատվիրատուի պատրաստ բժշկական ձևանմուշների բովանդակության ստեղծումն ու թվայնացումը՝ ոչ։</w:t>
+              <w:t>Ձևանմուշների կոնստրուկտորը և համաձայնեցված մեկնարկային փաթեթի ողջամիտ տեխնիկական աջակցությունը ներառված են, իսկ բժշկական/իրավական բովանդակությունը տրամադրում և վերջնականապես հաստատում է Պատվիրատուն։</w:t>
             </w:r>
           </w:p>
         </w:tc>
@@ -13354,6 +13492,234 @@
                 <w:sz w:val="18"/>
               </w:rPr>
               <w:t>Սույն ՏԱ-ում ուղղակիորեն չնշված գործառույթը կամ ինտեգրումը չի համարվում Փուլ I-ի ֆիքսված արժեքի մաս։</w:t>
+            </w:r>
+          </w:p>
+        </w:tc>
+        <w:tc>
+          <w:tcPr>
+            <w:tcW w:type="dxa" w:w="1123"/>
+            <w:vAlign w:val="center"/>
+            <w:tcMar>
+              <w:top w:w="90" w:type="dxa"/>
+              <w:start w:w="110" w:type="dxa"/>
+              <w:bottom w:w="90" w:type="dxa"/>
+              <w:end w:w="110" w:type="dxa"/>
+            </w:tcMar>
+            <w:shd w:fill="F5F8FC"/>
+          </w:tcPr>
+          <w:p>
+            <w:pPr>
+              <w:spacing w:after="0" w:line="245" w:lineRule="auto"/>
+              <w:jc w:val="center"/>
+            </w:pPr>
+            <w:r>
+              <w:rPr>
+                <w:rFonts w:ascii="Noto Sans Armenian" w:hAnsi="Noto Sans Armenian" w:eastAsia="Noto Sans Armenian" w:cs="Noto Sans Armenian"/>
+                <w:b w:val="0"/>
+                <w:color w:val="000000"/>
+                <w:sz w:val="18"/>
+              </w:rPr>
+              <w:t>____</w:t>
+            </w:r>
+          </w:p>
+        </w:tc>
+        <w:tc>
+          <w:tcPr>
+            <w:tcW w:type="dxa" w:w="1137"/>
+            <w:vAlign w:val="center"/>
+            <w:tcMar>
+              <w:top w:w="90" w:type="dxa"/>
+              <w:start w:w="110" w:type="dxa"/>
+              <w:bottom w:w="90" w:type="dxa"/>
+              <w:end w:w="110" w:type="dxa"/>
+            </w:tcMar>
+            <w:shd w:fill="F5F8FC"/>
+          </w:tcPr>
+          <w:p>
+            <w:pPr>
+              <w:spacing w:after="0" w:line="245" w:lineRule="auto"/>
+              <w:jc w:val="center"/>
+            </w:pPr>
+            <w:r>
+              <w:rPr>
+                <w:rFonts w:ascii="Noto Sans Armenian" w:hAnsi="Noto Sans Armenian" w:eastAsia="Noto Sans Armenian" w:cs="Noto Sans Armenian"/>
+                <w:b w:val="0"/>
+                <w:color w:val="000000"/>
+                <w:sz w:val="18"/>
+              </w:rPr>
+              <w:t>____</w:t>
+            </w:r>
+          </w:p>
+        </w:tc>
+      </w:tr>
+      <w:tr>
+        <w:trPr>
+          <w:cantSplit/>
+        </w:trPr>
+        <w:tc>
+          <w:tcPr>
+            <w:tcW w:type="dxa" w:w="547"/>
+            <w:vAlign w:val="center"/>
+            <w:tcMar>
+              <w:top w:w="90" w:type="dxa"/>
+              <w:start w:w="110" w:type="dxa"/>
+              <w:bottom w:w="90" w:type="dxa"/>
+              <w:end w:w="110" w:type="dxa"/>
+            </w:tcMar>
+          </w:tcPr>
+          <w:p>
+            <w:pPr>
+              <w:spacing w:after="0" w:line="245" w:lineRule="auto"/>
+              <w:jc w:val="center"/>
+            </w:pPr>
+            <w:r>
+              <w:rPr>
+                <w:rFonts w:ascii="Noto Sans Armenian" w:hAnsi="Noto Sans Armenian" w:eastAsia="Noto Sans Armenian" w:cs="Noto Sans Armenian"/>
+                <w:b w:val="0"/>
+                <w:color w:val="000000"/>
+                <w:sz w:val="18"/>
+              </w:rPr>
+              <w:t>13</w:t>
+            </w:r>
+          </w:p>
+        </w:tc>
+        <w:tc>
+          <w:tcPr>
+            <w:tcW w:type="dxa" w:w="7272"/>
+            <w:vAlign w:val="center"/>
+            <w:tcMar>
+              <w:top w:w="90" w:type="dxa"/>
+              <w:start w:w="110" w:type="dxa"/>
+              <w:bottom w:w="90" w:type="dxa"/>
+              <w:end w:w="110" w:type="dxa"/>
+            </w:tcMar>
+          </w:tcPr>
+          <w:p>
+            <w:pPr>
+              <w:spacing w:after="0" w:line="245" w:lineRule="auto"/>
+            </w:pPr>
+            <w:r>
+              <w:rPr>
+                <w:rFonts w:ascii="Noto Sans Armenian" w:hAnsi="Noto Sans Armenian" w:eastAsia="Noto Sans Armenian" w:cs="Noto Sans Armenian"/>
+                <w:b w:val="0"/>
+                <w:color w:val="000000"/>
+                <w:sz w:val="18"/>
+              </w:rPr>
+              <w:t>ARMED-ի հետ ավտոմատ ինտեգրումը Փուլ I-ում ներառված չէ․ մինչև հետագա ինտեգրումը Պատվիրատուն ինքնուրույն ապահովում է պետական համակարգին միացումը և պարտադիր տվյալների մուտքագրումը։</w:t>
+            </w:r>
+          </w:p>
+        </w:tc>
+        <w:tc>
+          <w:tcPr>
+            <w:tcW w:type="dxa" w:w="1123"/>
+            <w:vAlign w:val="center"/>
+            <w:tcMar>
+              <w:top w:w="90" w:type="dxa"/>
+              <w:start w:w="110" w:type="dxa"/>
+              <w:bottom w:w="90" w:type="dxa"/>
+              <w:end w:w="110" w:type="dxa"/>
+            </w:tcMar>
+          </w:tcPr>
+          <w:p>
+            <w:pPr>
+              <w:spacing w:after="0" w:line="245" w:lineRule="auto"/>
+              <w:jc w:val="center"/>
+            </w:pPr>
+            <w:r>
+              <w:rPr>
+                <w:rFonts w:ascii="Noto Sans Armenian" w:hAnsi="Noto Sans Armenian" w:eastAsia="Noto Sans Armenian" w:cs="Noto Sans Armenian"/>
+                <w:b w:val="0"/>
+                <w:color w:val="000000"/>
+                <w:sz w:val="18"/>
+              </w:rPr>
+              <w:t>____</w:t>
+            </w:r>
+          </w:p>
+        </w:tc>
+        <w:tc>
+          <w:tcPr>
+            <w:tcW w:type="dxa" w:w="1137"/>
+            <w:vAlign w:val="center"/>
+            <w:tcMar>
+              <w:top w:w="90" w:type="dxa"/>
+              <w:start w:w="110" w:type="dxa"/>
+              <w:bottom w:w="90" w:type="dxa"/>
+              <w:end w:w="110" w:type="dxa"/>
+            </w:tcMar>
+          </w:tcPr>
+          <w:p>
+            <w:pPr>
+              <w:spacing w:after="0" w:line="245" w:lineRule="auto"/>
+              <w:jc w:val="center"/>
+            </w:pPr>
+            <w:r>
+              <w:rPr>
+                <w:rFonts w:ascii="Noto Sans Armenian" w:hAnsi="Noto Sans Armenian" w:eastAsia="Noto Sans Armenian" w:cs="Noto Sans Armenian"/>
+                <w:b w:val="0"/>
+                <w:color w:val="000000"/>
+                <w:sz w:val="18"/>
+              </w:rPr>
+              <w:t>____</w:t>
+            </w:r>
+          </w:p>
+        </w:tc>
+      </w:tr>
+      <w:tr>
+        <w:trPr>
+          <w:cantSplit/>
+        </w:trPr>
+        <w:tc>
+          <w:tcPr>
+            <w:tcW w:type="dxa" w:w="547"/>
+            <w:vAlign w:val="center"/>
+            <w:tcMar>
+              <w:top w:w="90" w:type="dxa"/>
+              <w:start w:w="110" w:type="dxa"/>
+              <w:bottom w:w="90" w:type="dxa"/>
+              <w:end w:w="110" w:type="dxa"/>
+            </w:tcMar>
+            <w:shd w:fill="F5F8FC"/>
+          </w:tcPr>
+          <w:p>
+            <w:pPr>
+              <w:spacing w:after="0" w:line="245" w:lineRule="auto"/>
+              <w:jc w:val="center"/>
+            </w:pPr>
+            <w:r>
+              <w:rPr>
+                <w:rFonts w:ascii="Noto Sans Armenian" w:hAnsi="Noto Sans Armenian" w:eastAsia="Noto Sans Armenian" w:cs="Noto Sans Armenian"/>
+                <w:b w:val="0"/>
+                <w:color w:val="000000"/>
+                <w:sz w:val="18"/>
+              </w:rPr>
+              <w:t>14</w:t>
+            </w:r>
+          </w:p>
+        </w:tc>
+        <w:tc>
+          <w:tcPr>
+            <w:tcW w:type="dxa" w:w="7272"/>
+            <w:vAlign w:val="center"/>
+            <w:tcMar>
+              <w:top w:w="90" w:type="dxa"/>
+              <w:start w:w="110" w:type="dxa"/>
+              <w:bottom w:w="90" w:type="dxa"/>
+              <w:end w:w="110" w:type="dxa"/>
+            </w:tcMar>
+            <w:shd w:fill="F5F8FC"/>
+          </w:tcPr>
+          <w:p>
+            <w:pPr>
+              <w:spacing w:after="0" w:line="245" w:lineRule="auto"/>
+            </w:pPr>
+            <w:r>
+              <w:rPr>
+                <w:rFonts w:ascii="Noto Sans Armenian" w:hAnsi="Noto Sans Armenian" w:eastAsia="Noto Sans Armenian" w:cs="Noto Sans Armenian"/>
+                <w:b w:val="0"/>
+                <w:color w:val="000000"/>
+                <w:sz w:val="18"/>
+              </w:rPr>
+              <w:t>Մշակման մեկնարկից հետո Պատվիրատուն տրամադրում է կազմակերպական/սկզբնական տվյալների և փաստաթղթերի/ձևանմուշների երկու պարտադիր փաթեթները՝ բաժին 15.2-ի համաձայն։</w:t>
             </w:r>
           </w:p>
         </w:tc>

</xml_diff>

<commit_message>
docs: clarify phase one defect acceptance rules
</commit_message>
<xml_diff>
--- a/docs/contract/phase-1/Phase_1_Technical_Specification_HY.docx
+++ b/docs/contract/phase-1/Phase_1_Technical_Specification_HY.docx
@@ -85,7 +85,7 @@
                 <w:color w:val="000000"/>
                 <w:sz w:val="20"/>
               </w:rPr>
-              <w:t>1.1</w:t>
+              <w:t>1.2</w:t>
             </w:r>
           </w:p>
         </w:tc>
@@ -1242,7 +1242,7 @@
                 <w:color w:val="000000"/>
                 <w:sz w:val="19"/>
               </w:rPr>
-              <w:t>Թերություն, որի հետևանքով անհնար է մուտք գործել Համակարգ, գրանցել պացիենտ, պահպանել հիմնական բժշկական գրառում, իրականացնել առանցքային ֆինանսական գործողություն, կամ առաջանում է տվյալների կորուստ/վնասում կամ էականորեն սխալ ֆինանսական հաշվարկ։</w:t>
+              <w:t>Ծրագրային թերություն, Տեխնիկական առաջադրանքով ուղղակիորեն նախատեսված էական կամ հիմնական գործառույթի ամբողջական բացակայություն կամ այնպիսի անաշխատունակություն, որի հետևանքով անհնար է կամ էականորեն արգելափակվում է Համակարգի հիմնական աշխատանքային գործընթացներից որևէ մեկի իրականացումը։ Կրիտիկական/արգելափակող թերություն է համարվում նաև այն դեպքը, երբ անհնար է մուտք գործել Համակարգ, գրանցել պացիենտ, պահպանել հիմնական բժշկական գրառում, իրականացնել առանցքային ֆինանսական գործողություն, կամ առաջանում է տվյալների կորուստ, վնասում, չարտոնված հասանելիություն կամ արտահոսք, պացիենտի անվտանգության համար էական վտանգ կամ էականորեն սխալ բժշկական կամ ֆինանսական արդյունք։ Առանձին ոչ կրիտիկական սխալը, մասնակի թերությունը, տեսողական կամ տեխնիկական ոչ էական անհամապատասխանությունը, ինչպես նաև այն թերությունը, որը չի արգելափակում համապատասխան հիմնական աշխատանքային գործընթացը և ունի կիրառելի ժամանակավոր շրջանցման եղանակ, ինքնին կրիտիկական/արգելափակող թերություն չի համարվում։ Ժամանակավոր շրջանցման եղանակի առկայությունը թերությունը չի դարձնում ոչ կրիտիկական, եթե այն ստեղծում է պացիենտի անվտանգության, տվյալների ամբողջականության կամ գաղտնիության էական վտանգ կամ հանգեցնում է էականորեն սխալ բժշկական կամ ֆինանսական արդյունքի։</w:t>
             </w:r>
           </w:p>
         </w:tc>
@@ -10591,7 +10591,35 @@
           <w:color w:val="000000"/>
           <w:sz w:val="21"/>
         </w:rPr>
-        <w:t>13.3. Փորձնական թողարկման պահին կրիտիկական/արգելափակող թերություններ չեն թույլատրվում։ Հայտնի ոչ կրիտիկական թերությունները կարող են ներառվել փոխանցման միասնական գրանցամատյանում՝ նկարագրությամբ, առաջնահերթությամբ և շտկման կարգավիճակով։ Դրանք անվճար շտկվում են արտադրական փորձնական շահագործման ընթացքում։</w:t>
+        <w:t>13.3. Փորձնական թողարկման փոխանցման պահին կրիտիկական/արգելափակող թերություններ չեն թույլատրվում։</w:t>
+      </w:r>
+    </w:p>
+    <w:p>
+      <w:pPr>
+        <w:spacing w:after="100" w:line="259" w:lineRule="auto"/>
+      </w:pPr>
+      <w:r>
+        <w:rPr>
+          <w:rFonts w:ascii="Noto Sans Armenian" w:hAnsi="Noto Sans Armenian" w:eastAsia="Noto Sans Armenian" w:cs="Noto Sans Armenian"/>
+          <w:b w:val="0"/>
+          <w:color w:val="000000"/>
+          <w:sz w:val="21"/>
+        </w:rPr>
+        <w:t>Փորձնական թողարկման պահին կարող են առկա լինել հայտնի ոչ կրիտիկական թերություններ, մասնակի տեխնիկական անհամապատասխանություններ կամ այլ ոչ էական խնդիրներ, եթե դրանք չեն արգելափակում Համակարգի համապատասխան հիմնական աշխատանքային գործընթացների իրականացումը և չեն ստեղծում պացիենտի անվտանգության, տվյալների ամբողջականության կամ գաղտնիության էական վտանգ։</w:t>
+      </w:r>
+    </w:p>
+    <w:p>
+      <w:pPr>
+        <w:spacing w:after="100" w:line="259" w:lineRule="auto"/>
+      </w:pPr>
+      <w:r>
+        <w:rPr>
+          <w:rFonts w:ascii="Noto Sans Armenian" w:hAnsi="Noto Sans Armenian" w:eastAsia="Noto Sans Armenian" w:cs="Noto Sans Armenian"/>
+          <w:b w:val="0"/>
+          <w:color w:val="000000"/>
+          <w:sz w:val="21"/>
+        </w:rPr>
+        <w:t>Նման թերությունները ներառվում են Կատարողի կողմից վարվող և Կողմերի կողմից համաձայնեցվող միասնական թերությունների գրանցամատյանում՝ նկարագրությամբ, դասակարգմամբ, առաջնահերթությամբ, շտկման համաձայնեցված ժամկետով և կարգավիճակով։ Դրանք առանց լրացուցիչ մշակման վճարի շտկվում են արտադրական փորձնական շահագործման ընթացքում, իսկ եթե համաձայնեցված կերպով մնում են Փուլ I-ի վերջնական ընդունման պահին՝ գրանցամատյանում սահմանված ժամկետներում։</w:t>
       </w:r>
     </w:p>
     <w:p>
@@ -10814,7 +10842,7 @@
           <w:color w:val="000000"/>
           <w:sz w:val="21"/>
         </w:rPr>
-        <w:t>3. կրիտիկական և այլ ընդունումը խոչընդոտող էական թերությունները շտկվել են,</w:t>
+        <w:t>3. շտկվել են բոլոր կրիտիկական/արգելափակող թերությունները և այն այլ էական թերությունները, որոնք անհնար են դարձնում կամ էականորեն խոչընդոտում են Տեխնիկական առաջադրանքով նախատեսված հիմնական աշխատանքային գործընթացների պատշաճ իրականացումը,</w:t>
       </w:r>
     </w:p>
     <w:p>
@@ -10829,7 +10857,7 @@
           <w:color w:val="000000"/>
           <w:sz w:val="21"/>
         </w:rPr>
-        <w:t>4. մնացած ոչ էական թերությունները, եթե կան, ունեն կողմերի կողմից համաձայնեցված գրանցամատյան և շտկման կարգ,</w:t>
+        <w:t>4. մնացած ոչ էական և ոչ կրիտիկական թերությունները, եթե այդպիսիք առկա են, ներառված են Կատարողի կողմից վարվող և Կողմերի կողմից համաձայնեցված թերությունների գրանցամատյանում՝ սահմանված առաջնահերթությամբ, շտկման կարգով և ժամկետներով։ Նման թերությունների առկայությունն ինքնին չի խոչընդոտում Փուլ I-ի վերջնական ընդունմանը,</w:t>
       </w:r>
     </w:p>
     <w:p>
@@ -11013,6 +11041,20 @@
           <w:sz w:val="21"/>
         </w:rPr>
         <w:t>Համակարգի համաձայնեցված տեխնիկական սահմաններից դուրս օգտագործմանը։</w:t>
+      </w:r>
+    </w:p>
+    <w:p>
+      <w:pPr>
+        <w:spacing w:after="100" w:line="259" w:lineRule="auto"/>
+      </w:pPr>
+      <w:r>
+        <w:rPr>
+          <w:rFonts w:ascii="Noto Sans Armenian" w:hAnsi="Noto Sans Armenian" w:eastAsia="Noto Sans Armenian" w:cs="Noto Sans Armenian"/>
+          <w:b w:val="0"/>
+          <w:color w:val="000000"/>
+          <w:sz w:val="21"/>
+        </w:rPr>
+        <w:t>Բաժին 14.2-ի 4-րդ ենթակետի համաձայն համաձայնեցված գրանցամատյանում ներառված թերությունները շտկվում են այդ գրանցամատյանով սահմանված կարգով և ժամկետներում՝ առանց լրացուցիչ մշակման վճարի։ Վերջնական ընդունման ակտի ստորագրումը Կատարողին չի ազատում այդ թերությունների շտկման պարտավորությունից։</w:t>
       </w:r>
     </w:p>
     <w:p>
@@ -13035,7 +13077,7 @@
                 <w:color w:val="000000"/>
                 <w:sz w:val="18"/>
               </w:rPr>
-              <w:t>Չորս ամիս անց փոխանցվում է production pilot-release, ոչ թե վերջնական ակտ. հայտնի ոչ կրիտիկական թերությունները կարող են շտկվել փորձնական շահագործման ընթացքում։</w:t>
+              <w:t>Չորս ամիս անց փոխանցվում է production pilot-release, ոչ թե վերջնական ակտ. հայտնի ոչ կրիտիկական թերությունները կարող են շտկվել փորձնական շահագործման ընթացքում և համաձայնեցված գրանցամատյանով ինքնին չեն խոչընդոտում վերջնական ընդունմանը։</w:t>
             </w:r>
           </w:p>
         </w:tc>
@@ -15079,21 +15121,12 @@
     </w:tbl>
     <w:p>
       <w:pPr>
-        <w:spacing w:after="20"/>
-      </w:pPr>
-    </w:p>
-    <w:p>
-      <w:pPr>
-        <w:spacing w:after="100" w:line="259" w:lineRule="auto"/>
+        <w:spacing w:after="0" w:before="0" w:lineRule="exact" w:line="120"/>
       </w:pPr>
       <w:r>
         <w:rPr>
-          <w:rFonts w:ascii="Noto Sans Armenian" w:hAnsi="Noto Sans Armenian" w:eastAsia="Noto Sans Armenian" w:cs="Noto Sans Armenian"/>
-          <w:b/>
-          <w:color w:val="000000"/>
-          <w:sz w:val="21"/>
+          <w:sz w:val="12"/>
         </w:rPr>
-        <w:t>Փաստաթղթի վերջ</w:t>
       </w:r>
     </w:p>
     <w:sectPr>

</xml_diff>

<commit_message>
docs: narrow phase one data ownership clause
</commit_message>
<xml_diff>
--- a/docs/contract/phase-1/Phase_1_Technical_Specification_HY.docx
+++ b/docs/contract/phase-1/Phase_1_Technical_Specification_HY.docx
@@ -85,7 +85,7 @@
                 <w:color w:val="000000"/>
                 <w:sz w:val="20"/>
               </w:rPr>
-              <w:t>1.2</w:t>
+              <w:t>1.3</w:t>
             </w:r>
           </w:p>
         </w:tc>
@@ -474,7 +474,7 @@
           <w:color w:val="000000"/>
           <w:sz w:val="19"/>
         </w:rPr>
-        <w:t>9. Տվյալների սեփականություն, արտահանում և սկզբնական կոդ</w:t>
+        <w:t>9. Տվյալների սեփականություն և սկզբնական կոդ</w:t>
       </w:r>
     </w:p>
     <w:p>
@@ -9546,7 +9546,7 @@
           <w:color w:val="000000"/>
           <w:sz w:val="31"/>
         </w:rPr>
-        <w:t>9. Տվյալների սեփականություն, արտահանում և սկզբնական կոդ</w:t>
+        <w:t>9. Տվյալների սեփականություն և սկզբնական կոդ</w:t>
       </w:r>
     </w:p>
     <w:p>
@@ -9575,20 +9575,6 @@
           <w:sz w:val="21"/>
         </w:rPr>
         <w:t>Համակարգում Պատվիրատուի գործունեության արդյունքում ստեղծված բժշկական, ֆինանսական, տեղեկատու, ադմինիստրատիվ տվյալները, փաստաթղթերը, կարգավորումները և թվային նյութերը պատկանում են Պատվիրատուին։</w:t>
-      </w:r>
-    </w:p>
-    <w:p>
-      <w:pPr>
-        <w:spacing w:after="100" w:line="259" w:lineRule="auto"/>
-      </w:pPr>
-      <w:r>
-        <w:rPr>
-          <w:rFonts w:ascii="Noto Sans Armenian" w:hAnsi="Noto Sans Armenian" w:eastAsia="Noto Sans Armenian" w:cs="Noto Sans Armenian"/>
-          <w:b w:val="0"/>
-          <w:color w:val="000000"/>
-          <w:sz w:val="21"/>
-        </w:rPr>
-        <w:t>Պատվիրատուն իրավունք ունի առանց լրացուցիչ ծրագրային լիցենզիայի կամ Կատարողի առանձին թույլտվության ստանալ իր տվյալների ամբողջական կառուցվածքային արտահանումը, ներառյալ օգտատերերի և Audit Trail-ի տվյալները։ Ստանդարտ համաձայնեցված արտահանման մեխանիզմը ներառված է։ Հատուկ ոչ ստանդարտ ձևաչափը, տվյալների լրացուցիչ փոխակերպումը կամ մեծ ծավալի փաթեթի ձեռքով պատրաստումը կարող է գնահատվել առանձին՝ առանց Պատվիրատուի տվյալների նկատմամբ իրավունքը սահմանափակելու։</w:t>
       </w:r>
     </w:p>
     <w:p>

</xml_diff>